<commit_message>
v34 Round 11: manuscript_v34.docx
</commit_message>
<xml_diff>
--- a/manuscript_v34.docx
+++ b/manuscript_v34.docx
@@ -164,7 +164,7 @@
         <w:jc w:val="left"/>
       </w:pPr>
       <w:r>
-        <w:t>The key question is when evidence integration actually improves therapeutic target prioritization. We use pancreatic ductal adenocarcinoma (PDAC) as a testbed because it combines extensive functional-dependency data with genomic, network and pharmacological annotations 1–2,15–16,21. We audit this question across nine evidence layers and six primary endpoints with different provenance, comparing fixed-form composites with single-layer and supervised baselines. We then test whether apparent gains persist after removing label-embedded evidence, recoding missing annotations, varying the aggregation rule and transferring the scoring functions across contexts 5–6,9–10. This design distinguishes predictive evaluation from circular benchmark diagnostics and tests whether an integration advantage survives explicit challenges to evidence overlap and implementation choices.</w:t>
+        <w:t>The key question is when evidence integration actually improves therapeutic target prioritization. We use pancreatic ductal adenocarcinoma (PDAC) as a testbed because it combines extensive functional-dependency data with genomic, network and pharmacological annotations 1–2,15–16. We audit this question across nine evidence layers and six primary endpoints with different provenance, comparing fixed-form composites with single-layer and supervised baselines. We then test whether apparent gains persist after removing label-embedded evidence, recoding missing annotations, varying the aggregation rule and transferring the scoring functions across contexts 5–6,9–10. This design distinguishes predictive evaluation from circular benchmark diagnostics and tests whether an integration advantage survives explicit challenges to evidence overlap and implementation choices.</w:t>
       </w:r>
     </w:p>
     <w:p>
@@ -417,7 +417,7 @@
         <w:rPr>
           <w:rFonts w:ascii="Arial" w:hAnsi="Arial"/>
         </w:rPr>
-        <w:t xml:space="preserve">The ranking of methods transferred from PDAC to colorectal dependency without refitting: centrality remained ahead of the harmonic composite on E4 (0.702 versus 0.576), and method-level AUROCs were perfectly correlated between E1 and E4 (Spearman rho = 1.00). Because both contexts used DepMap 23Q2, this result represents cross-context transfer rather than fully independent external validation. We next tested whether the pattern depended on genetic dependency as the endpoint. In E6, median natural-log IC50 across 29 pancreatic cell lines was used to define 32 nominal-target positives from 125 compounds. Network centrality achieved an AUROC of 0.910, compared with 0.846 for the harmonic composite and 0.780 for tractability alone (Fig. 6). Thus, a pharmacological-response proxy did not provide evidence for a fixed-form integration advantage. Studies of drug-response prediction likewise show that translating models from cell lines to tumours requires explicit transfer or validation rather than assuming transportability </w:t>
+        <w:t xml:space="preserve">The ranking of methods transferred from PDAC to colorectal dependency without refitting: centrality remained ahead of the harmonic composite on E4 (0.702 versus 0.576), and method-level AUROCs were perfectly correlated between E1 and E4 (Spearman rho = 1.00). Because both contexts used DepMap 23Q2, this result represents cross-context transfer rather than fully independent external validation. We next tested whether the pattern depended on genetic dependency as the endpoint. In E6, median natural-log IC50 across 29 pancreatic cell lines was used to define 32 nominal-target positives from 125 compounds. Network centrality achieved an AUROC of 0.910, compared with 0.846 for the harmonic composite and 0.780 for tractability alone, whereas the random-forest learner reached 0.913, slightly above centrality (Fig. 6). Thus, a pharmacological-response proxy did not provide evidence for a fixed-form integration advantage. Studies of drug-response prediction likewise show that translating models from cell lines to tumours requires explicit transfer or validation rather than assuming transportability </w:t>
       </w:r>
       <w:r>
         <w:rPr>
@@ -666,7 +666,7 @@
           <w:rFonts w:ascii="Arial" w:hAnsi="Arial"/>
           <w:vertAlign w:val="superscript"/>
         </w:rPr>
-        <w:t>22</w:t>
+        <w:t>23</w:t>
       </w:r>
       <w:r>
         <w:rPr>
@@ -679,7 +679,7 @@
           <w:rFonts w:ascii="Arial" w:hAnsi="Arial"/>
           <w:vertAlign w:val="superscript"/>
         </w:rPr>
-        <w:t>23–24</w:t>
+        <w:t>22,24</w:t>
       </w:r>
       <w:r>
         <w:rPr>
@@ -705,7 +705,7 @@
           <w:rFonts w:ascii="Arial" w:hAnsi="Arial"/>
           <w:vertAlign w:val="superscript"/>
         </w:rPr>
-        <w:t>23</w:t>
+        <w:t>24</w:t>
       </w:r>
       <w:r>
         <w:rPr>
@@ -768,7 +768,7 @@
         <w:spacing w:after="100"/>
       </w:pPr>
       <w:r>
-        <w:t xml:space="preserve">Eight operational endpoints were evaluated, of which six were treated as independent primary evaluation endpoints. E1 was PDAC-wide dependency, defined from DepMap 23Q2 Chronos gene effect in pancreatic cell lines below the essentiality threshold </w:t>
+        <w:t xml:space="preserve">Eight operational endpoints were evaluated, of which six were treated as primary evaluation endpoints. E1 was PDAC-wide dependency, defined from DepMap 23Q2 Chronos gene effect in pancreatic cell lines below the essentiality threshold </w:t>
       </w:r>
       <w:r>
         <w:rPr>
@@ -777,7 +777,7 @@
         <w:t>1–2</w:t>
       </w:r>
       <w:r>
-        <w:t xml:space="preserve"> (4,584 positives). E2 was PDAC-enriched dependency, defined as the upper quartile of a PDAC-versus-other selectivity statistic among E1 positives (1,147 positives); because it is nested within E1, it was not counted as an independent primary endpoint. E3 was an essential-and-druggable construct, defined as E1 positivity plus an annotated druggability label (1,159 positives). E3-A removed the druggability conjunct from E3 and therefore reproduced the E1 positive set exactly (4,584 positives); it was retained for continuity but not counted independently. E3-C used the chemical-tractability layer directly as the label (5,188 positives) and served as a circular control. E4 was colorectal cancer zero-shot transfer: the PDAC scoring functions were applied without refitting to DepMap 23Q2 colorectal lines (4,608 positives). E5 measured historical concordance with the nominal primary targets of agents entering pancreatic-cancer clinical development (35 positives). E6 was a pharmacological-response proxy based on Genomics of Drug Sensitivity in Cancer (GDSC): among 125 compounds with annotated targets, a gene was positive when it was the nominal target of a compound in the most sensitive tertile across 29 pancreatic cell lines and not in the most resistant tertile, yielding 32 positives </w:t>
+        <w:t xml:space="preserve"> (4,584 positives). E2 was PDAC-enriched dependency, defined as the upper quartile of a PDAC-versus-other selectivity statistic among E1 positives (1,147 positives); because it is nested within E1, it was not counted as a primary endpoint. E3 was an essential-and-druggable construct, defined as E1 positivity plus an annotated druggability label (1,159 positives). E3-A removed the druggability conjunct from E3 and therefore reproduced the E1 positive set exactly (4,584 positives); it was retained for continuity but not counted independently. E3-C used the chemical-tractability layer directly as the label (5,188 positives) and served as a circular control. E4 was colorectal cancer zero-shot transfer: the PDAC scoring functions were applied without refitting to DepMap 23Q2 colorectal lines (4,608 positives). E5 measured historical concordance with the nominal primary targets of agents entering pancreatic-cancer clinical development (35 positives). E6 was a pharmacological-response proxy based on Genomics of Drug Sensitivity in Cancer (GDSC): among 125 compounds with annotated targets, a gene was positive when it was the nominal target of a compound in the most sensitive tertile across 29 pancreatic cell lines and not in the most resistant tertile, yielding 32 positives </w:t>
       </w:r>
       <w:r>
         <w:rPr>
@@ -886,7 +886,7 @@
         <w:rPr>
           <w:rFonts w:ascii="Arial" w:hAnsi="Arial"/>
         </w:rPr>
-        <w:t>ersus centrality, and deletion of the label-embedded druggability layer from E3. All other scorer-endpoint comparisons were exploratory. Eight operational endpoints were examined, but only six were treated as independent primary endpoints; P values were th</w:t>
+        <w:t>ersus centrality, and deletion of the label-embedded druggability layer from E3. All other scorer-endpoint comparisons were exploratory. Eight operational endpoints were examined, but only six were treated as primary endpoints; P values were th</w:t>
       </w:r>
       <w:r>
         <w:rPr>
@@ -930,7 +930,7 @@
         <w:rPr>
           <w:rFonts w:ascii="Arial" w:hAnsi="Arial"/>
         </w:rPr>
-        <w:t>vals, negative controls, functional-form analyses and the full 1,000-draw Dirichlet weight-space analysis. The run record is identified by git commit SHA 493c297e7704ab39e21182a7a09b535ac24a44b9 and results-manifest SHA-256 f41a3ccd1cbe64d6c115f59aebb09a6f0158beeca97fa00686da143a14eaad38.</w:t>
+        <w:t>vals, negative controls, functional-form analyses and the full 1,000-draw Dirichlet weight-space analysis. The run record is identified by git commit SHA 16f9d3531fb1dd6ea5803c779b02d3fd2e75948c and results-manifest SHA-256 7aee16f5ddc4885c7dea72683cbfd3e8c59fffc84d8ff708ef16fb85cff92269.</w:t>
       </w:r>
     </w:p>
     <w:p>

</xml_diff>

<commit_message>
v34 Round 12: manuscript_v34.docx
</commit_message>
<xml_diff>
--- a/manuscript_v34.docx
+++ b/manuscript_v34.docx
@@ -930,7 +930,7 @@
         <w:rPr>
           <w:rFonts w:ascii="Arial" w:hAnsi="Arial"/>
         </w:rPr>
-        <w:t>vals, negative controls, functional-form analyses and the full 1,000-draw Dirichlet weight-space analysis. The run record is identified by git commit SHA 16f9d3531fb1dd6ea5803c779b02d3fd2e75948c and results-manifest SHA-256 7aee16f5ddc4885c7dea72683cbfd3e8c59fffc84d8ff708ef16fb85cff92269.</w:t>
+        <w:t>vals, negative controls, functional-form analyses and the full 1,000-draw Dirichlet weight-space analysis. The run record is identified by git commit SHA 0d000c31ebc56ed7308c75d4bc4b51328cae2aa2 and results-manifest SHA-256 58918c162107f163910d9179fe676855b0df7a1a5837c166321cc968b4bf963a.</w:t>
       </w:r>
     </w:p>
     <w:p>
@@ -1074,7 +1074,7 @@
         <w:rPr>
           <w:rFonts w:ascii="Arial" w:hAnsi="Arial"/>
         </w:rPr>
-        <w:t>AUROC for 13 scorers across eight operational endpoints, with a diverging colour scale centred at chance (AUROC = 0.5). Constructed and circular diagnostics E3 and E3-C are marked separately. AUROC = 1.000 on E3-C is displayed as a label-as-input control, not as predictive performance.</w:t>
+        <w:t>AUROC for 13 scorers across eight operational endpoints, with a sequential colour scale from light (low AUROC) to dark blue (high AUROC). Constructed and circular diagnostics E3 and E3-C are marked separately. AUROC = 1.000 on E3-C is displayed as a label-as-input control, not as predictive performance.</w:t>
       </w:r>
     </w:p>
     <w:p>

</xml_diff>